<commit_message>
change azure service = mymemory
</commit_message>
<xml_diff>
--- a/docs/PRD TourVoice – Quận 6.docx
+++ b/docs/PRD TourVoice – Quận 6.docx
@@ -193,7 +193,7 @@
           <w:sz w:val="26"/>
           <w:szCs w:val="26"/>
         </w:rPr>
-        <w:t>Xây web app ưu tiên điện thoại, chạy trên mọi trình duyệt phổ biến, không cần cài ứng dụng. Phía sau là ASP.NET Core Web API chia 3 lớp (Presentation, BLL, DAL) và SQL Server; web khách và dashboard admin là React + Vite + TypeScript.</w:t>
+        <w:t xml:space="preserve">Xây web app ưu tiên điện thoại, chạy trên mọi trình duyệt phổ biến, không cần cài ứng dụng. Phía sau là ASP.NET Core Web API chia 3 lớp (Presentation, BLL, DAL) và MySQL; API và MySQL chạy bằng docker compose trên một máy chủ Docker; web khách và dashboard admin là React + Vite + TypeScript.</w:t>
       </w:r>
     </w:p>
     <w:p>
@@ -242,7 +242,7 @@
           <w:szCs w:val="26"/>
         </w:rPr>
         <w:lastRenderedPageBreak/>
-        <w:t>Khách chạm vào điểm đến hoặc món để nghe thuyết minh và đọc mô tả bằng 1 trong 5 ngôn ngữ (vi, en, zh, ko, ja). Audio được tạo sẵn một lần bằng TTS miễn phí, lưu dạng mp3 trên Azure Blob, trình duyệt tải trực tiếp.</w:t>
+        <w:t xml:space="preserve">Khách chạm vào điểm đến hoặc món để nghe thuyết minh và đọc mô tả bằng 1 trong 5 ngôn ngữ (vi, en, zh, ko, ja). Trình duyệt đọc to bài đã duyệt bằng giọng có sẵn trên thiết bị (Web Speech API), nên không cần tạo, lưu hay tải file âm thanh.</w:t>
       </w:r>
     </w:p>
     <w:p>
@@ -314,7 +314,7 @@
           <w:sz w:val="26"/>
           <w:szCs w:val="26"/>
         </w:rPr>
-        <w:t>Dashboard cho admin: quản lý địa điểm và món, dịch máy và duyệt văn bản, tạo audio, sinh mã QR, xem số người đang truy cập và hạn mức dịch vụ miễn phí.</w:t>
+        <w:t xml:space="preserve">Dashboard cho admin: quản lý địa điểm và món, dịch máy và duyệt văn bản, nghe thử bằng giọng thiết bị, sinh mã QR, xem số người đang truy cập và hạn mức dịch MyMemory trong ngày.</w:t>
       </w:r>
     </w:p>
     <w:p>
@@ -338,7 +338,7 @@
           <w:sz w:val="26"/>
           <w:szCs w:val="26"/>
         </w:rPr>
-        <w:t>Chỉ tích hợp ba dịch vụ ngoài: giọng đọc (Azure AI Speech F0), dịch máy (Azure Translator F0) và bản đồ. Mọi thứ khác do nhóm tự xây.</w:t>
+        <w:t xml:space="preserve">Chỉ tích hợp hai dịch vụ ngoài: dịch máy (MyMemory, miễn phí 50.000 ký tự/ngày khi gửi kèm email) và bản đồ. Giọng đọc là Web Speech API có sẵn trong trình duyệt. Mọi thứ khác do nhóm tự xây.</w:t>
       </w:r>
     </w:p>
     <w:p>
@@ -406,7 +406,7 @@
           <w:sz w:val="26"/>
           <w:szCs w:val="26"/>
         </w:rPr>
-        <w:t>Mỗi người bấm Nghe audio và nghe bài thuyết minh đã được admin duyệt, tạo sẵn bằng giọng đọc phù hợp ngôn ngữ. Nếu bản mp3 chưa có, trình phát tự chuyển sang giọng của thiết bị để không bị “tịt đường”.</w:t>
+        <w:t xml:space="preserve">Mỗi người bấm Nghe và nghe bài thuyết minh đã được admin duyệt, đọc bằng giọng của chính điện thoại theo đúng ngôn ngữ. Máy nào chưa cài giọng cho ngôn ngữ đó thì trang hiện bản chữ kèm gợi ý cài giọng, nên không ai bị “tịt đường”.</w:t>
       </w:r>
     </w:p>
     <w:p>
@@ -478,7 +478,7 @@
           <w:sz w:val="26"/>
           <w:szCs w:val="26"/>
         </w:rPr>
-        <w:t>Trước đó, admin đã soạn bài tiếng Việt, bấm dịch máy sang 4 ngôn ngữ còn lại, sửa và duyệt từng bản, rồi bấm tạo audio; hệ thống chặn gọi dịch vụ khi dùng tới 90% hạn mức miễn phí.</w:t>
+        <w:t xml:space="preserve">Trước đó, admin đã soạn bài tiếng Việt, bấm dịch máy bằng MyMemory sang 4 ngôn ngữ còn lại, nghe thử, sửa và duyệt từng bản; hệ thống chặn gọi MyMemory khi lượng ký tự trong ngày chạm 90% hạn mức miễn phí.</w:t>
       </w:r>
     </w:p>
     <w:p>
@@ -523,7 +523,7 @@
           <w:sz w:val="26"/>
           <w:szCs w:val="26"/>
         </w:rPr>
-        <w:t>Cung cấp trải nghiệm thuyết minh tự động, đa ngôn ngữ cho 4 điểm đến và ít nhất 12 món/quán: 4 điểm đến và ≥ 12 món có audio ở cả 5 ngôn ngữ.</w:t>
+        <w:t xml:space="preserve">Cung cấp trải nghiệm thuyết minh tự động, đa ngôn ngữ cho 4 điểm đến và ít nhất 12 món/quán: 4 điểm đến và ≥ 12 món có bản thuyết minh Reviewed ở cả 5 ngôn ngữ.</w:t>
       </w:r>
     </w:p>
     <w:p>
@@ -547,7 +547,7 @@
           <w:sz w:val="26"/>
           <w:szCs w:val="26"/>
         </w:rPr>
-        <w:t>Chi phí dịch vụ ngoài bằng 0đ; ký tự TTS và dịch dùng trong tháng luôn ≤ 90% hạn mức miễn phí.</w:t>
+        <w:t xml:space="preserve">Chi phí dịch vụ ngoài bằng 0đ; ký tự gửi MyMemory trong ngày luôn ≤ 90% hạn mức miễn phí (45.000 trên 50.000 ký tự).</w:t>
       </w:r>
     </w:p>
     <w:p>
@@ -709,7 +709,7 @@
           <w:sz w:val="26"/>
           <w:szCs w:val="26"/>
         </w:rPr>
-        <w:t>Trình duyệt chỉ đọc dữ liệu qua API; chỉ lớp DAL mới nói chuyện với SQL Server, Blob Storage và Azure. File mp3 và ảnh được trình duyệt tải thẳng từ Blob nên API không phải truyền file lớn.</w:t>
+        <w:t xml:space="preserve">Trình duyệt chỉ đọc dữ liệu qua API; chỉ lớp DAL mới nói chuyện với MySQL, thư mục ảnh (volume uploads) và MyMemory API. API và MySQL chạy cùng một máy chủ Docker; giọng đọc chạy ngay trong trình duyệt nên API không phải tạo hay truyền file âm thanh.</w:t>
       </w:r>
     </w:p>
     <w:p>
@@ -732,9 +732,9 @@
         <w:lastRenderedPageBreak/>
         <w:drawing>
           <wp:inline distT="0" distB="0" distL="0" distR="0">
-            <wp:extent cx="5943600" cy="3377393"/>
+            <wp:extent cx="5943600" cy="3204203"/>
             <wp:effectExtent l="0" t="0" r="0" b="0"/>
-            <wp:docPr id="19" name="Picture 19" descr="D:\dowload\tài liệu\tourvoice\TourVoice_PRD_Diagrams_PNG\out-11.png"/>
+            <wp:docPr id="19" name="Picture 19" descr="11 System architecture"/>
             <wp:cNvGraphicFramePr>
               <a:graphicFrameLocks xmlns:a="http://schemas.openxmlformats.org/drawingml/2006/main" noChangeAspect="1"/>
             </wp:cNvGraphicFramePr>
@@ -742,7 +742,7 @@
               <a:graphicData uri="http://schemas.openxmlformats.org/drawingml/2006/picture">
                 <pic:pic xmlns:pic="http://schemas.openxmlformats.org/drawingml/2006/picture">
                   <pic:nvPicPr>
-                    <pic:cNvPr id="0" name="Picture 3" descr="D:\dowload\tài liệu\tourvoice\TourVoice_PRD_Diagrams_PNG\out-11.png"/>
+                    <pic:cNvPr id="0" name="Picture 3" descr="11 System architecture"/>
                     <pic:cNvPicPr>
                       <a:picLocks noChangeAspect="1" noChangeArrowheads="1"/>
                     </pic:cNvPicPr>
@@ -763,7 +763,7 @@
                   <pic:spPr bwMode="auto">
                     <a:xfrm>
                       <a:off x="0" y="0"/>
-                      <a:ext cx="5943600" cy="3377393"/>
+                      <a:ext cx="5943600" cy="3204203"/>
                     </a:xfrm>
                     <a:prstGeom prst="rect">
                       <a:avLst/>
@@ -871,9 +871,9 @@
         <w:lastRenderedPageBreak/>
         <w:drawing>
           <wp:inline distT="0" distB="0" distL="0" distR="0">
-            <wp:extent cx="5943600" cy="3645408"/>
+            <wp:extent cx="5943600" cy="3740193"/>
             <wp:effectExtent l="0" t="0" r="0" b="0"/>
-            <wp:docPr id="20" name="Picture 20" descr="D:\dowload\tài liệu\tourvoice\TourVoice_PRD_Diagrams_PNG\out-12.png"/>
+            <wp:docPr id="20" name="Picture 20" descr="12 Three-layer architecture"/>
             <wp:cNvGraphicFramePr>
               <a:graphicFrameLocks xmlns:a="http://schemas.openxmlformats.org/drawingml/2006/main" noChangeAspect="1"/>
             </wp:cNvGraphicFramePr>
@@ -881,7 +881,7 @@
               <a:graphicData uri="http://schemas.openxmlformats.org/drawingml/2006/picture">
                 <pic:pic xmlns:pic="http://schemas.openxmlformats.org/drawingml/2006/picture">
                   <pic:nvPicPr>
-                    <pic:cNvPr id="0" name="Picture 4" descr="D:\dowload\tài liệu\tourvoice\TourVoice_PRD_Diagrams_PNG\out-12.png"/>
+                    <pic:cNvPr id="0" name="Picture 4" descr="12 Three-layer architecture"/>
                     <pic:cNvPicPr>
                       <a:picLocks noChangeAspect="1" noChangeArrowheads="1"/>
                     </pic:cNvPicPr>
@@ -902,7 +902,7 @@
                   <pic:spPr bwMode="auto">
                     <a:xfrm>
                       <a:off x="0" y="0"/>
-                      <a:ext cx="5943600" cy="3645408"/>
+                      <a:ext cx="5943600" cy="3740193"/>
                     </a:xfrm>
                     <a:prstGeom prst="rect">
                       <a:avLst/>
@@ -994,15 +994,15 @@
           <w:sz w:val="26"/>
           <w:szCs w:val="26"/>
         </w:rPr>
-        <w:t>Thuyết minh audio</w:t>
-      </w:r>
-      <w:r>
-        <w:rPr>
-          <w:rFonts w:ascii="Times New Roman" w:hAnsi="Times New Roman" w:cs="Times New Roman"/>
-          <w:sz w:val="26"/>
-          <w:szCs w:val="26"/>
-        </w:rPr>
-        <w:t xml:space="preserve"> (FR-08, FR-09): trình phát có tua ±10 giây, 3 tốc độ, một bài phát tại một thời điểm; thiếu mp3 thì chuyển sang giọng thiết bị (Web Speech API); ghi lượt nghe ẩn danh.</w:t>
+        <w:t xml:space="preserve">Thuyết minh bằng giọng thiết bị</w:t>
+      </w:r>
+      <w:r>
+        <w:rPr>
+          <w:rFonts w:ascii="Times New Roman" w:hAnsi="Times New Roman" w:cs="Times New Roman"/>
+          <w:sz w:val="26"/>
+          <w:szCs w:val="26"/>
+        </w:rPr>
+        <w:t xml:space="preserve"> (FR-08, FR-09): trình phát dùng Web Speech API, đọc từng câu, tạm dừng/tiếp tục, lùi hoặc tới một câu, 3 tốc độ, một bài đọc tại một thời điểm; máy thiếu giọng thì hiện bản chữ; ghi lượt nghe ẩn danh.</w:t>
       </w:r>
     </w:p>
     <w:p>
@@ -1144,15 +1144,15 @@
           <w:szCs w:val="26"/>
         </w:rPr>
         <w:lastRenderedPageBreak/>
-        <w:t>Pipeline nội dung tự động</w:t>
-      </w:r>
-      <w:r>
-        <w:rPr>
-          <w:rFonts w:ascii="Times New Roman" w:hAnsi="Times New Roman" w:cs="Times New Roman"/>
-          <w:sz w:val="26"/>
-          <w:szCs w:val="26"/>
-        </w:rPr>
-        <w:t xml:space="preserve"> (FR-23–26): admin nhập bài tiếng Việt, dịch máy sang 4 ngôn ngữ, sửa và duyệt, rồi tạo audio mp3 bằng TTS; dùng lại mp3 nếu văn bản không đổi và chặn gọi dịch vụ khi dùng tới 90% hạn mức.</w:t>
+        <w:t xml:space="preserve">Pipeline nội dung tự động</w:t>
+      </w:r>
+      <w:r>
+        <w:rPr>
+          <w:rFonts w:ascii="Times New Roman" w:hAnsi="Times New Roman" w:cs="Times New Roman"/>
+          <w:sz w:val="26"/>
+          <w:szCs w:val="26"/>
+        </w:rPr>
+        <w:t xml:space="preserve"> (FR-23–26): admin nhập bài tiếng Việt, dịch máy sang 4 ngôn ngữ bằng MyMemory, nghe thử, sửa và duyệt; không dịch lại nếu bản tiếng Việt không đổi và chặn gọi MyMemory khi dùng tới 90% hạn mức ngày.</w:t>
       </w:r>
     </w:p>
     <w:p>
@@ -1177,15 +1177,15 @@
           <w:sz w:val="26"/>
           <w:szCs w:val="26"/>
         </w:rPr>
-        <w:t>Cơ sở dữ liệu</w:t>
-      </w:r>
-      <w:r>
-        <w:rPr>
-          <w:rFonts w:ascii="Times New Roman" w:hAnsi="Times New Roman" w:cs="Times New Roman"/>
-          <w:sz w:val="26"/>
-          <w:szCs w:val="26"/>
-        </w:rPr>
-        <w:t xml:space="preserve"> (mục Data model): lưu địa điểm, món, tọa độ, 5 bản dịch mỗi Place, trạng thái audio, lượt nghe, phiên truy cập và nhật ký dùng dịch vụ.</w:t>
+        <w:t xml:space="preserve">Cơ sở dữ liệu</w:t>
+      </w:r>
+      <w:r>
+        <w:rPr>
+          <w:rFonts w:ascii="Times New Roman" w:hAnsi="Times New Roman" w:cs="Times New Roman"/>
+          <w:sz w:val="26"/>
+          <w:szCs w:val="26"/>
+        </w:rPr>
+        <w:t xml:space="preserve"> (mục Data model): MySQL lưu địa điểm, món, tọa độ, 5 bản dịch mỗi Place, trạng thái duyệt, lượt nghe, phiên truy cập và nhật ký gọi MyMemory.</w:t>
       </w:r>
     </w:p>
     <w:p>
@@ -1276,15 +1276,15 @@
           <w:sz w:val="26"/>
           <w:szCs w:val="26"/>
         </w:rPr>
-        <w:t>CI/CD và triển khai</w:t>
-      </w:r>
-      <w:r>
-        <w:rPr>
-          <w:rFonts w:ascii="Times New Roman" w:hAnsi="Times New Roman" w:cs="Times New Roman"/>
-          <w:sz w:val="26"/>
-          <w:szCs w:val="26"/>
-        </w:rPr>
-        <w:t>: GitHub Actions chạy 3 job song song trên mọi PR (backend, frontend, docker); sau khi merge, đẩy image lên GHCR, chạy migration, triển khai Azure Container Apps; frontend tự triển khai trên Vercel (hoặc Cloudflare Pages).</w:t>
+        <w:t xml:space="preserve">CI/CD và triển khai</w:t>
+      </w:r>
+      <w:r>
+        <w:rPr>
+          <w:rFonts w:ascii="Times New Roman" w:hAnsi="Times New Roman" w:cs="Times New Roman"/>
+          <w:sz w:val="26"/>
+          <w:szCs w:val="26"/>
+        </w:rPr>
+        <w:t xml:space="preserve">: GitHub Actions chạy 3 job song song trên mọi PR (backend, frontend, docker); sau khi merge, đẩy image lên GHCR, chạy migration vào MySQL, rồi SSH vào máy chủ Docker để docker compose pull và up -d; frontend tự triển khai trên Vercel (hoặc Cloudflare Pages).</w:t>
       </w:r>
     </w:p>
     <w:p>
@@ -1307,9 +1307,9 @@
         <w:lastRenderedPageBreak/>
         <w:drawing>
           <wp:inline distT="0" distB="0" distL="0" distR="0">
-            <wp:extent cx="5943600" cy="4004330"/>
+            <wp:extent cx="5943600" cy="4069854"/>
             <wp:effectExtent l="0" t="0" r="0" b="0"/>
-            <wp:docPr id="21" name="Picture 21" descr="D:\dowload\tài liệu\tourvoice\TourVoice_PRD_Diagrams_PNG\out-1.png"/>
+            <wp:docPr id="21" name="Picture 21" descr="01 Use case"/>
             <wp:cNvGraphicFramePr>
               <a:graphicFrameLocks xmlns:a="http://schemas.openxmlformats.org/drawingml/2006/main" noChangeAspect="1"/>
             </wp:cNvGraphicFramePr>
@@ -1317,7 +1317,7 @@
               <a:graphicData uri="http://schemas.openxmlformats.org/drawingml/2006/picture">
                 <pic:pic xmlns:pic="http://schemas.openxmlformats.org/drawingml/2006/picture">
                   <pic:nvPicPr>
-                    <pic:cNvPr id="0" name="Picture 5" descr="D:\dowload\tài liệu\tourvoice\TourVoice_PRD_Diagrams_PNG\out-1.png"/>
+                    <pic:cNvPr id="0" name="Picture 5" descr="01 Use case"/>
                     <pic:cNvPicPr>
                       <a:picLocks noChangeAspect="1" noChangeArrowheads="1"/>
                     </pic:cNvPicPr>
@@ -1338,7 +1338,7 @@
                   <pic:spPr bwMode="auto">
                     <a:xfrm>
                       <a:off x="0" y="0"/>
-                      <a:ext cx="5943600" cy="4004330"/>
+                      <a:ext cx="5943600" cy="4069854"/>
                     </a:xfrm>
                     <a:prstGeom prst="rect">
                       <a:avLst/>
@@ -1561,9 +1561,9 @@
         </w:rPr>
         <w:drawing>
           <wp:inline distT="0" distB="0" distL="0" distR="0">
-            <wp:extent cx="5943600" cy="3638939"/>
+            <wp:extent cx="5943600" cy="3722057"/>
             <wp:effectExtent l="0" t="0" r="0" b="0"/>
-            <wp:docPr id="23" name="Picture 23" descr="D:\dowload\tài liệu\tourvoice\TourVoice_PRD_Diagrams_PNG\out-3.png"/>
+            <wp:docPr id="23" name="Picture 23" descr="03 Navigation map"/>
             <wp:cNvGraphicFramePr>
               <a:graphicFrameLocks xmlns:a="http://schemas.openxmlformats.org/drawingml/2006/main" noChangeAspect="1"/>
             </wp:cNvGraphicFramePr>
@@ -1571,7 +1571,7 @@
               <a:graphicData uri="http://schemas.openxmlformats.org/drawingml/2006/picture">
                 <pic:pic xmlns:pic="http://schemas.openxmlformats.org/drawingml/2006/picture">
                   <pic:nvPicPr>
-                    <pic:cNvPr id="0" name="Picture 7" descr="D:\dowload\tài liệu\tourvoice\TourVoice_PRD_Diagrams_PNG\out-3.png"/>
+                    <pic:cNvPr id="0" name="Picture 7" descr="03 Navigation map"/>
                     <pic:cNvPicPr>
                       <a:picLocks noChangeAspect="1" noChangeArrowheads="1"/>
                     </pic:cNvPicPr>
@@ -1592,7 +1592,7 @@
                   <pic:spPr bwMode="auto">
                     <a:xfrm>
                       <a:off x="0" y="0"/>
-                      <a:ext cx="5943600" cy="3638939"/>
+                      <a:ext cx="5943600" cy="3722057"/>
                     </a:xfrm>
                     <a:prstGeom prst="rect">
                       <a:avLst/>
@@ -1646,7 +1646,7 @@
           <w:sz w:val="26"/>
           <w:szCs w:val="26"/>
         </w:rPr>
-        <w:t>Admin nhập bài tiếng Việt và duyệt thành Reviewed; chỉ khi đó nút “Dịch phần thiếu” mới bật. Hệ thống dịch máy sang 4 ngôn ngữ còn lại, kết quả vào Draft (nguồn = Machine). Admin sửa và duyệt từng ngôn ngữ (Reviewed) rồi bấm “Tạo audio”: bản dịch đi qua Generating và kết thúc ở AudioReady, hoặc AudioFailed (có nút thử lại). Sửa lại một bản đã có audio thì phải duyệt và tạo audio lại.</w:t>
+        <w:t xml:space="preserve">Admin nhập bài tiếng Việt và duyệt thành Reviewed; chỉ khi đó nút “Dịch phần thiếu” mới bật. Hệ thống gọi MyMemory dịch sang 4 ngôn ngữ còn lại (cắt bài thành các đoạn ≤ 500 byte), kết quả vào Draft (nguồn = Machine). Admin nghe thử bằng giọng thiết bị, sửa và duyệt từng ngôn ngữ (Reviewed). Sửa lại một bản đã duyệt thì nó về Draft và phải duyệt lại; không còn bước tạo audio.</w:t>
       </w:r>
     </w:p>
     <w:p>
@@ -1669,9 +1669,9 @@
         <w:lastRenderedPageBreak/>
         <w:drawing>
           <wp:inline distT="0" distB="0" distL="0" distR="0">
-            <wp:extent cx="6105525" cy="8352298"/>
+            <wp:extent cx="5943600" cy="7580759"/>
             <wp:effectExtent l="0" t="0" r="0" b="0"/>
-            <wp:docPr id="24" name="Picture 24" descr="D:\dowload\tài liệu\tourvoice\TourVoice_PRD_Diagrams_PNG\out-14.png"/>
+            <wp:docPr id="24" name="Picture 24" descr="14 SD-02 Translate"/>
             <wp:cNvGraphicFramePr>
               <a:graphicFrameLocks xmlns:a="http://schemas.openxmlformats.org/drawingml/2006/main" noChangeAspect="1"/>
             </wp:cNvGraphicFramePr>
@@ -1679,7 +1679,7 @@
               <a:graphicData uri="http://schemas.openxmlformats.org/drawingml/2006/picture">
                 <pic:pic xmlns:pic="http://schemas.openxmlformats.org/drawingml/2006/picture">
                   <pic:nvPicPr>
-                    <pic:cNvPr id="0" name="Picture 8" descr="D:\dowload\tài liệu\tourvoice\TourVoice_PRD_Diagrams_PNG\out-14.png"/>
+                    <pic:cNvPr id="0" name="Picture 8" descr="14 SD-02 Translate"/>
                     <pic:cNvPicPr>
                       <a:picLocks noChangeAspect="1" noChangeArrowheads="1"/>
                     </pic:cNvPicPr>
@@ -1700,7 +1700,7 @@
                   <pic:spPr bwMode="auto">
                     <a:xfrm>
                       <a:off x="0" y="0"/>
-                      <a:ext cx="6105525" cy="8352298"/>
+                      <a:ext cx="5943600" cy="7580759"/>
                     </a:xfrm>
                     <a:prstGeom prst="rect">
                       <a:avLst/>
@@ -1737,9 +1737,9 @@
         <w:lastRenderedPageBreak/>
         <w:drawing>
           <wp:inline distT="0" distB="0" distL="0" distR="0">
-            <wp:extent cx="5943600" cy="2535769"/>
+            <wp:extent cx="5943600" cy="2303145"/>
             <wp:effectExtent l="0" t="0" r="0" b="0"/>
-            <wp:docPr id="32" name="Picture 32" descr="D:\dowload\tài liệu\tourvoice\TourVoice_PRD_Diagrams_PNG\out-4.png"/>
+            <wp:docPr id="32" name="Picture 32" descr="04 SM PlaceTranslation"/>
             <wp:cNvGraphicFramePr>
               <a:graphicFrameLocks xmlns:a="http://schemas.openxmlformats.org/drawingml/2006/main" noChangeAspect="1"/>
             </wp:cNvGraphicFramePr>
@@ -1747,7 +1747,7 @@
               <a:graphicData uri="http://schemas.openxmlformats.org/drawingml/2006/picture">
                 <pic:pic xmlns:pic="http://schemas.openxmlformats.org/drawingml/2006/picture">
                   <pic:nvPicPr>
-                    <pic:cNvPr id="0" name="Picture 16" descr="D:\dowload\tài liệu\tourvoice\TourVoice_PRD_Diagrams_PNG\out-4.png"/>
+                    <pic:cNvPr id="0" name="Picture 16" descr="04 SM PlaceTranslation"/>
                     <pic:cNvPicPr>
                       <a:picLocks noChangeAspect="1" noChangeArrowheads="1"/>
                     </pic:cNvPicPr>
@@ -1768,7 +1768,7 @@
                   <pic:spPr bwMode="auto">
                     <a:xfrm>
                       <a:off x="0" y="0"/>
-                      <a:ext cx="5943600" cy="2535769"/>
+                      <a:ext cx="5943600" cy="2303145"/>
                     </a:xfrm>
                     <a:prstGeom prst="rect">
                       <a:avLst/>
@@ -1822,7 +1822,7 @@
           <w:sz w:val="26"/>
           <w:szCs w:val="26"/>
         </w:rPr>
-        <w:t>Trình duyệt lấy chi tiết Place theo ngôn ngữ, tải mp3 thẳng từ Blob và ghi lượt nghe sau 10 giây. Nếu chưa có mp3, trình phát chuyển sang giọng thiết bị.</w:t>
+        <w:t xml:space="preserve">Trình duyệt lấy chi tiết Place theo ngôn ngữ, đọc bài bằng Web Speech API theo từng câu và ghi lượt nghe sau 10 giây. Nếu máy không có giọng cho ngôn ngữ đó, trang hiện bản chữ.</w:t>
       </w:r>
     </w:p>
     <w:p>
@@ -1845,9 +1845,9 @@
         <w:lastRenderedPageBreak/>
         <w:drawing>
           <wp:inline distT="0" distB="0" distL="0" distR="0">
-            <wp:extent cx="5943600" cy="6729436"/>
+            <wp:extent cx="5943600" cy="7524143"/>
             <wp:effectExtent l="0" t="0" r="0" b="0"/>
-            <wp:docPr id="27" name="Picture 27" descr="D:\dowload\tài liệu\tourvoice\TourVoice_PRD_Diagrams_PNG\out-13.png"/>
+            <wp:docPr id="27" name="Picture 27" descr="13 SD-01 Listen"/>
             <wp:cNvGraphicFramePr>
               <a:graphicFrameLocks xmlns:a="http://schemas.openxmlformats.org/drawingml/2006/main" noChangeAspect="1"/>
             </wp:cNvGraphicFramePr>
@@ -1855,7 +1855,7 @@
               <a:graphicData uri="http://schemas.openxmlformats.org/drawingml/2006/picture">
                 <pic:pic xmlns:pic="http://schemas.openxmlformats.org/drawingml/2006/picture">
                   <pic:nvPicPr>
-                    <pic:cNvPr id="0" name="Picture 11" descr="D:\dowload\tài liệu\tourvoice\TourVoice_PRD_Diagrams_PNG\out-13.png"/>
+                    <pic:cNvPr id="0" name="Picture 11" descr="13 SD-01 Listen"/>
                     <pic:cNvPicPr>
                       <a:picLocks noChangeAspect="1" noChangeArrowheads="1"/>
                     </pic:cNvPicPr>
@@ -1876,7 +1876,7 @@
                   <pic:spPr bwMode="auto">
                     <a:xfrm>
                       <a:off x="0" y="0"/>
-                      <a:ext cx="5943600" cy="6729436"/>
+                      <a:ext cx="5943600" cy="7524143"/>
                     </a:xfrm>
                     <a:prstGeom prst="rect">
                       <a:avLst/>
@@ -1913,9 +1913,9 @@
         <w:lastRenderedPageBreak/>
         <w:drawing>
           <wp:inline distT="0" distB="0" distL="0" distR="0">
-            <wp:extent cx="5943600" cy="2640903"/>
+            <wp:extent cx="5943600" cy="2748915"/>
             <wp:effectExtent l="0" t="0" r="0" b="0"/>
-            <wp:docPr id="31" name="Picture 31" descr="D:\dowload\tài liệu\tourvoice\TourVoice_PRD_Diagrams_PNG\out-5.png"/>
+            <wp:docPr id="31" name="Picture 31" descr="05 SM audio player"/>
             <wp:cNvGraphicFramePr>
               <a:graphicFrameLocks xmlns:a="http://schemas.openxmlformats.org/drawingml/2006/main" noChangeAspect="1"/>
             </wp:cNvGraphicFramePr>
@@ -1923,7 +1923,7 @@
               <a:graphicData uri="http://schemas.openxmlformats.org/drawingml/2006/picture">
                 <pic:pic xmlns:pic="http://schemas.openxmlformats.org/drawingml/2006/picture">
                   <pic:nvPicPr>
-                    <pic:cNvPr id="0" name="Picture 15" descr="D:\dowload\tài liệu\tourvoice\TourVoice_PRD_Diagrams_PNG\out-5.png"/>
+                    <pic:cNvPr id="0" name="Picture 15" descr="05 SM audio player"/>
                     <pic:cNvPicPr>
                       <a:picLocks noChangeAspect="1" noChangeArrowheads="1"/>
                     </pic:cNvPicPr>
@@ -1944,7 +1944,7 @@
                   <pic:spPr bwMode="auto">
                     <a:xfrm>
                       <a:off x="0" y="0"/>
-                      <a:ext cx="5943600" cy="2640903"/>
+                      <a:ext cx="5943600" cy="2748915"/>
                     </a:xfrm>
                     <a:prstGeom prst="rect">
                       <a:avLst/>
@@ -2021,9 +2021,9 @@
         <w:lastRenderedPageBreak/>
         <w:drawing>
           <wp:inline distT="0" distB="0" distL="0" distR="0">
-            <wp:extent cx="5943600" cy="5602670"/>
+            <wp:extent cx="5943600" cy="5715000"/>
             <wp:effectExtent l="0" t="0" r="0" b="0"/>
-            <wp:docPr id="30" name="Picture 30" descr="D:\dowload\tài liệu\tourvoice\TourVoice_PRD_Diagrams_PNG\out-15.png"/>
+            <wp:docPr id="30" name="Picture 30" descr="15 SD-03 Sign in"/>
             <wp:cNvGraphicFramePr>
               <a:graphicFrameLocks xmlns:a="http://schemas.openxmlformats.org/drawingml/2006/main" noChangeAspect="1"/>
             </wp:cNvGraphicFramePr>
@@ -2031,7 +2031,7 @@
               <a:graphicData uri="http://schemas.openxmlformats.org/drawingml/2006/picture">
                 <pic:pic xmlns:pic="http://schemas.openxmlformats.org/drawingml/2006/picture">
                   <pic:nvPicPr>
-                    <pic:cNvPr id="0" name="Picture 14" descr="D:\dowload\tài liệu\tourvoice\TourVoice_PRD_Diagrams_PNG\out-15.png"/>
+                    <pic:cNvPr id="0" name="Picture 14" descr="15 SD-03 Sign in"/>
                     <pic:cNvPicPr>
                       <a:picLocks noChangeAspect="1" noChangeArrowheads="1"/>
                     </pic:cNvPicPr>
@@ -2052,7 +2052,7 @@
                   <pic:spPr bwMode="auto">
                     <a:xfrm>
                       <a:off x="0" y="0"/>
-                      <a:ext cx="5943600" cy="5602670"/>
+                      <a:ext cx="5943600" cy="5715000"/>
                     </a:xfrm>
                     <a:prstGeom prst="rect">
                       <a:avLst/>
@@ -2141,9 +2141,9 @@
         <w:lastRenderedPageBreak/>
         <w:drawing>
           <wp:inline distT="0" distB="0" distL="0" distR="0" wp14:anchorId="7A6B8490" wp14:editId="09C9818D">
-            <wp:extent cx="5943600" cy="2190116"/>
+            <wp:extent cx="5943600" cy="2324372"/>
             <wp:effectExtent l="0" t="0" r="0" b="0"/>
-            <wp:docPr id="34" name="Picture 34" descr="D:\dowload\tài liệu\tourvoice\TourVoice_PRD_Diagrams_PNG\out-6.png"/>
+            <wp:docPr id="34" name="Picture 34" descr="06 SM presence"/>
             <wp:cNvGraphicFramePr>
               <a:graphicFrameLocks xmlns:a="http://schemas.openxmlformats.org/drawingml/2006/main" noChangeAspect="1"/>
             </wp:cNvGraphicFramePr>
@@ -2151,7 +2151,7 @@
               <a:graphicData uri="http://schemas.openxmlformats.org/drawingml/2006/picture">
                 <pic:pic xmlns:pic="http://schemas.openxmlformats.org/drawingml/2006/picture">
                   <pic:nvPicPr>
-                    <pic:cNvPr id="0" name="Picture 18" descr="D:\dowload\tài liệu\tourvoice\TourVoice_PRD_Diagrams_PNG\out-6.png"/>
+                    <pic:cNvPr id="0" name="Picture 18" descr="06 SM presence"/>
                     <pic:cNvPicPr>
                       <a:picLocks noChangeAspect="1" noChangeArrowheads="1"/>
                     </pic:cNvPicPr>
@@ -2172,7 +2172,7 @@
                   <pic:spPr bwMode="auto">
                     <a:xfrm>
                       <a:off x="0" y="0"/>
-                      <a:ext cx="5943600" cy="2190116"/>
+                      <a:ext cx="5943600" cy="2324372"/>
                     </a:xfrm>
                     <a:prstGeom prst="rect">
                       <a:avLst/>
@@ -2208,23 +2208,7 @@
           <w:szCs w:val="26"/>
         </w:rPr>
         <w:lastRenderedPageBreak/>
-        <w:t>7</w:t>
-      </w:r>
-      <w:r>
-        <w:rPr>
-          <w:rFonts w:ascii="Times New Roman" w:hAnsi="Times New Roman" w:cs="Times New Roman"/>
-          <w:sz w:val="26"/>
-          <w:szCs w:val="26"/>
-        </w:rPr>
-        <w:t xml:space="preserve">. </w:t>
-      </w:r>
-      <w:r>
-        <w:rPr>
-          <w:rFonts w:ascii="Times New Roman" w:hAnsi="Times New Roman" w:cs="Times New Roman"/>
-          <w:sz w:val="26"/>
-          <w:szCs w:val="26"/>
-        </w:rPr>
-        <w:t>Các sequence còn lại</w:t>
+        <w:t xml:space="preserve">7. Các sequence còn lại</w:t>
       </w:r>
     </w:p>
     <w:p>
@@ -2248,9 +2232,9 @@
         <w:lastRenderedPageBreak/>
         <w:drawing>
           <wp:inline distT="0" distB="0" distL="0" distR="0">
-            <wp:extent cx="5943600" cy="8332805"/>
+            <wp:extent cx="5943600" cy="5187303"/>
             <wp:effectExtent l="0" t="0" r="0" b="0"/>
-            <wp:docPr id="41" name="Picture 41" descr="D:\dowload\tài liệu\tourvoice\TourVoice_PRD_Diagrams_PNG\out-17.png"/>
+            <wp:docPr id="41" name="Picture 41" descr="17 SD-05 Review"/>
             <wp:cNvGraphicFramePr>
               <a:graphicFrameLocks xmlns:a="http://schemas.openxmlformats.org/drawingml/2006/main" noChangeAspect="1"/>
             </wp:cNvGraphicFramePr>
@@ -2258,7 +2242,7 @@
               <a:graphicData uri="http://schemas.openxmlformats.org/drawingml/2006/picture">
                 <pic:pic xmlns:pic="http://schemas.openxmlformats.org/drawingml/2006/picture">
                   <pic:nvPicPr>
-                    <pic:cNvPr id="0" name="Picture 25" descr="D:\dowload\tài liệu\tourvoice\TourVoice_PRD_Diagrams_PNG\out-17.png"/>
+                    <pic:cNvPr id="0" name="Picture 25" descr="17 SD-05 Review"/>
                     <pic:cNvPicPr>
                       <a:picLocks noChangeAspect="1" noChangeArrowheads="1"/>
                     </pic:cNvPicPr>
@@ -2279,7 +2263,7 @@
                   <pic:spPr bwMode="auto">
                     <a:xfrm>
                       <a:off x="0" y="0"/>
-                      <a:ext cx="5943600" cy="8332805"/>
+                      <a:ext cx="5943600" cy="5187303"/>
                     </a:xfrm>
                     <a:prstGeom prst="rect">
                       <a:avLst/>
@@ -2304,9 +2288,9 @@
         <w:lastRenderedPageBreak/>
         <w:drawing>
           <wp:inline distT="0" distB="0" distL="0" distR="0">
-            <wp:extent cx="5943600" cy="5364499"/>
+            <wp:extent cx="5943600" cy="5486400"/>
             <wp:effectExtent l="0" t="0" r="0" b="0"/>
-            <wp:docPr id="42" name="Picture 42" descr="D:\dowload\tài liệu\tourvoice\TourVoice_PRD_Diagrams_PNG\out-18.png"/>
+            <wp:docPr id="42" name="Picture 42" descr="18 SD-06 Publish"/>
             <wp:cNvGraphicFramePr>
               <a:graphicFrameLocks xmlns:a="http://schemas.openxmlformats.org/drawingml/2006/main" noChangeAspect="1"/>
             </wp:cNvGraphicFramePr>
@@ -2314,7 +2298,7 @@
               <a:graphicData uri="http://schemas.openxmlformats.org/drawingml/2006/picture">
                 <pic:pic xmlns:pic="http://schemas.openxmlformats.org/drawingml/2006/picture">
                   <pic:nvPicPr>
-                    <pic:cNvPr id="0" name="Picture 26" descr="D:\dowload\tài liệu\tourvoice\TourVoice_PRD_Diagrams_PNG\out-18.png"/>
+                    <pic:cNvPr id="0" name="Picture 26" descr="18 SD-06 Publish"/>
                     <pic:cNvPicPr>
                       <a:picLocks noChangeAspect="1" noChangeArrowheads="1"/>
                     </pic:cNvPicPr>
@@ -2335,7 +2319,7 @@
                   <pic:spPr bwMode="auto">
                     <a:xfrm>
                       <a:off x="0" y="0"/>
-                      <a:ext cx="5943600" cy="5364499"/>
+                      <a:ext cx="5943600" cy="5486400"/>
                     </a:xfrm>
                     <a:prstGeom prst="rect">
                       <a:avLst/>
@@ -2360,9 +2344,9 @@
         <w:lastRenderedPageBreak/>
         <w:drawing>
           <wp:inline distT="0" distB="0" distL="0" distR="0">
-            <wp:extent cx="5943600" cy="5747359"/>
+            <wp:extent cx="5943600" cy="5854147"/>
             <wp:effectExtent l="0" t="0" r="0" b="0"/>
-            <wp:docPr id="43" name="Picture 43" descr="D:\dowload\tài liệu\tourvoice\TourVoice_PRD_Diagrams_PNG\out-19.png"/>
+            <wp:docPr id="43" name="Picture 43" descr="19 SD-07 Register"/>
             <wp:cNvGraphicFramePr>
               <a:graphicFrameLocks xmlns:a="http://schemas.openxmlformats.org/drawingml/2006/main" noChangeAspect="1"/>
             </wp:cNvGraphicFramePr>
@@ -2370,7 +2354,7 @@
               <a:graphicData uri="http://schemas.openxmlformats.org/drawingml/2006/picture">
                 <pic:pic xmlns:pic="http://schemas.openxmlformats.org/drawingml/2006/picture">
                   <pic:nvPicPr>
-                    <pic:cNvPr id="0" name="Picture 27" descr="D:\dowload\tài liệu\tourvoice\TourVoice_PRD_Diagrams_PNG\out-19.png"/>
+                    <pic:cNvPr id="0" name="Picture 27" descr="19 SD-07 Register"/>
                     <pic:cNvPicPr>
                       <a:picLocks noChangeAspect="1" noChangeArrowheads="1"/>
                     </pic:cNvPicPr>
@@ -2391,7 +2375,7 @@
                   <pic:spPr bwMode="auto">
                     <a:xfrm>
                       <a:off x="0" y="0"/>
-                      <a:ext cx="5943600" cy="5747359"/>
+                      <a:ext cx="5943600" cy="5854147"/>
                     </a:xfrm>
                     <a:prstGeom prst="rect">
                       <a:avLst/>
@@ -2416,9 +2400,9 @@
         <w:lastRenderedPageBreak/>
         <w:drawing>
           <wp:inline distT="0" distB="0" distL="0" distR="0">
-            <wp:extent cx="5943600" cy="8128373"/>
+            <wp:extent cx="5943600" cy="8150086"/>
             <wp:effectExtent l="0" t="0" r="0" b="0"/>
-            <wp:docPr id="44" name="Picture 44" descr="D:\dowload\tài liệu\tourvoice\TourVoice_PRD_Diagrams_PNG\out-20.png"/>
+            <wp:docPr id="44" name="Picture 44" descr="20 SD-08 Favorites"/>
             <wp:cNvGraphicFramePr>
               <a:graphicFrameLocks xmlns:a="http://schemas.openxmlformats.org/drawingml/2006/main" noChangeAspect="1"/>
             </wp:cNvGraphicFramePr>
@@ -2426,7 +2410,7 @@
               <a:graphicData uri="http://schemas.openxmlformats.org/drawingml/2006/picture">
                 <pic:pic xmlns:pic="http://schemas.openxmlformats.org/drawingml/2006/picture">
                   <pic:nvPicPr>
-                    <pic:cNvPr id="0" name="Picture 28" descr="D:\dowload\tài liệu\tourvoice\TourVoice_PRD_Diagrams_PNG\out-20.png"/>
+                    <pic:cNvPr id="0" name="Picture 28" descr="20 SD-08 Favorites"/>
                     <pic:cNvPicPr>
                       <a:picLocks noChangeAspect="1" noChangeArrowheads="1"/>
                     </pic:cNvPicPr>
@@ -2447,7 +2431,7 @@
                   <pic:spPr bwMode="auto">
                     <a:xfrm>
                       <a:off x="0" y="0"/>
-                      <a:ext cx="5943600" cy="8128373"/>
+                      <a:ext cx="5943600" cy="8150086"/>
                     </a:xfrm>
                     <a:prstGeom prst="rect">
                       <a:avLst/>
@@ -2502,7 +2486,7 @@
           <w:sz w:val="26"/>
           <w:szCs w:val="26"/>
         </w:rPr>
-        <w:t>Mỗi pull request chạy 3 job song song (backend, frontend, docker). Sau khi merge vào main, workflow cd.yml build image, chạy bundle migration EF Core, triển khai Container Apps, kiểm tra /health và tự quay về image trước nếu kiểm tra lỗi.</w:t>
+        <w:t xml:space="preserve">Mỗi pull request chạy 3 job song song (backend, frontend, docker). Sau khi merge vào main, workflow cd.yml build image, đẩy lên GHCR, chạy bundle migration EF Core vào MySQL, SSH vào máy chủ Docker chạy docker compose pull và up -d, kiểm tra /health và tự quay về image trước nếu kiểm tra lỗi.</w:t>
       </w:r>
     </w:p>
     <w:p>
@@ -2524,9 +2508,9 @@
         </w:rPr>
         <w:drawing>
           <wp:inline distT="0" distB="0" distL="0" distR="0">
-            <wp:extent cx="5943600" cy="2879397"/>
+            <wp:extent cx="5943600" cy="2990972"/>
             <wp:effectExtent l="0" t="0" r="0" b="0"/>
-            <wp:docPr id="35" name="Picture 35" descr="D:\dowload\tài liệu\tourvoice\TourVoice_PRD_Diagrams_PNG\out-22.png"/>
+            <wp:docPr id="35" name="Picture 35" descr="22 CI-CD pipeline"/>
             <wp:cNvGraphicFramePr>
               <a:graphicFrameLocks xmlns:a="http://schemas.openxmlformats.org/drawingml/2006/main" noChangeAspect="1"/>
             </wp:cNvGraphicFramePr>
@@ -2534,7 +2518,7 @@
               <a:graphicData uri="http://schemas.openxmlformats.org/drawingml/2006/picture">
                 <pic:pic xmlns:pic="http://schemas.openxmlformats.org/drawingml/2006/picture">
                   <pic:nvPicPr>
-                    <pic:cNvPr id="0" name="Picture 19" descr="D:\dowload\tài liệu\tourvoice\TourVoice_PRD_Diagrams_PNG\out-22.png"/>
+                    <pic:cNvPr id="0" name="Picture 19" descr="22 CI-CD pipeline"/>
                     <pic:cNvPicPr>
                       <a:picLocks noChangeAspect="1" noChangeArrowheads="1"/>
                     </pic:cNvPicPr>
@@ -2555,7 +2539,7 @@
                   <pic:spPr bwMode="auto">
                     <a:xfrm>
                       <a:off x="0" y="0"/>
-                      <a:ext cx="5943600" cy="2879397"/>
+                      <a:ext cx="5943600" cy="2990972"/>
                     </a:xfrm>
                     <a:prstGeom prst="rect">
                       <a:avLst/>
@@ -2699,16 +2683,9 @@
           <w:sz w:val="26"/>
           <w:szCs w:val="26"/>
         </w:rPr>
-        <w:t xml:space="preserve">Nội dung gồm 5 ngôn ngữ: vi, en, zh, ko, ja. Thứ tự chọn ngôn ngữ: lựa chọn khách đã lưu, rồi ngôn ngữ của trình duyệt (nếu thuộc 5 ngôn ngữ), rồi tiếng Việt. Đổi ngôn ngữ ở thanh điều hướng đổi đồng thời văn bản, nhãn giao diện và audio; giọng đọc cố định cho </w:t>
-      </w:r>
-      <w:r>
-        <w:rPr>
-          <w:rFonts w:ascii="Times New Roman" w:hAnsi="Times New Roman" w:cs="Times New Roman"/>
-          <w:sz w:val="26"/>
-          <w:szCs w:val="26"/>
-        </w:rPr>
+        <w:t xml:space="preserve">Nội dung gồm 5 ngôn ngữ: vi, en, zh, ko, ja. Thứ tự chọn ngôn ngữ: lựa chọn khách đã lưu, rồi ngôn ngữ của trình duyệt (nếu thuộc 5 ngôn ngữ), rồi tiếng Việt. Đổi ngôn ngữ ở thanh điều hướng đổi đồng thời văn bản, nhãn giao diện và giọng đọc; mã dùng cho </w:t>
         <w:lastRenderedPageBreak/>
-        <w:t>từng ngôn ngữ: vi-VN-HoaiMyNeural, en-US-JennyNeural, zh-CN-XiaoxiaoNeural, ko-KR-SunHiNeural, ja-JP-NanamiNeural.</w:t>
+        <w:t xml:space="preserve">từng ngôn ngữ: MyMemory nhận vi, en, zh-CN, ko, ja; Web Speech chọn giọng theo vi-VN, en-US, zh-CN, ko-KR, ja-JP.</w:t>
       </w:r>
     </w:p>
     <w:p>
@@ -2776,7 +2753,7 @@
           <w:sz w:val="26"/>
           <w:szCs w:val="26"/>
         </w:rPr>
-        <w:t>Nút “Dịch phần thiếu” chỉ bật khi bản tiếng Việt đã Reviewed. Azure Translator dịch sang 4 ngôn ngữ còn lại; mỗi bản vào Draft với nguồn = Machine.</w:t>
+        <w:t xml:space="preserve">Nút “Dịch phần thiếu” chỉ bật khi bản tiếng Việt đã Reviewed. BLL chọn các ngôn ngữ còn thiếu hoặc đã cũ, rồi DAL gọi MyMemory (GET /get?q=…&amp;langpair=vi|en&amp;de=email nhóm) cho từng đoạn ≤ 500 byte và ghép kết quả; mỗi bản vào Draft với nguồn = Machine.</w:t>
       </w:r>
     </w:p>
     <w:p>
@@ -2800,7 +2777,7 @@
           <w:sz w:val="26"/>
           <w:szCs w:val="26"/>
         </w:rPr>
-        <w:t>Admin sửa và duyệt từng ngôn ngữ (Draft sang Reviewed); chỉ bản Reviewed mới được tạo audio.</w:t>
+        <w:t xml:space="preserve">Admin nghe thử bằng giọng thiết bị, sửa và duyệt từng ngôn ngữ (Draft sang Reviewed); chỉ bản Reviewed mới hiển thị cho khách.</w:t>
       </w:r>
     </w:p>
     <w:p>
@@ -2824,7 +2801,7 @@
           <w:sz w:val="26"/>
           <w:szCs w:val="26"/>
         </w:rPr>
-        <w:t>Tạo audio bằng Azure AI Speech: bản dịch vào Generating, mp3 lưu lên Blob, rồi chuyển AudioReady (hoặc AudioFailed nếu lỗi). Một SaveChanges trong một transaction cập nhật bản dịch (URL, thời lượng, hash) và ghi một dòng UsageLogs.</w:t>
+        <w:t xml:space="preserve">Một SaveChanges trong một transaction cập nhật bản dịch (văn bản, SourceHash, điểm match của MyMemory) và ghi một dòng UsageLogs (số ký tự, số đoạn, thành công hay lỗi). MyMemory trả responseStatus khác 200 thì API trả 502; các ngôn ngữ đã lưu trước đó giữ nguyên Draft.</w:t>
       </w:r>
     </w:p>
     <w:p>
@@ -2848,7 +2825,7 @@
           <w:sz w:val="26"/>
           <w:szCs w:val="26"/>
         </w:rPr>
-        <w:t>Tái sử dụng (BR-05): mỗi audio lưu hash của (văn bản + giọng). Hash không đổi thì không gọi lại TTS.</w:t>
+        <w:t xml:space="preserve">Không dịch lại (BR-05): mỗi bản dịch lưu SourceHash = SHA-256 của bản tiếng Việt đã duyệt. Hash không đổi thì không gọi lại MyMemory; hash khác thì bản dịch được đánh dấu “bản gốc đã đổi” để admin dịch lại.</w:t>
       </w:r>
     </w:p>
     <w:p>
@@ -2872,7 +2849,7 @@
           <w:sz w:val="26"/>
           <w:szCs w:val="26"/>
         </w:rPr>
-        <w:t>Chặn hạn mức (BR-06): trước mỗi lần gọi Translator hoặc Speech, BLL cộng ký tự tháng này từ bảng UsageLogs; khi đạt 90% hạn mức, yêu cầu bị từ chối và dashboard cảnh báo.</w:t>
+        <w:t xml:space="preserve">Chặn hạn mức (BR-06): trước mỗi lần gọi MyMemory, BLL cộng ký tự đã gửi trong ngày (UTC) từ bảng UsageLogs; nếu cộng thêm phần sắp gửi vượt 45.000 ký tự (90% của 50.000 ký tự/ngày), yêu cầu bị từ chối với mã 429 và dashboard cảnh báo.</w:t>
       </w:r>
     </w:p>
     <w:p>
@@ -2896,7 +2873,7 @@
           <w:sz w:val="26"/>
           <w:szCs w:val="26"/>
         </w:rPr>
-        <w:t>Ước tính cho đồ án: audio khoảng 59.000 ký tự (≈12% của 500.000), dịch khoảng 47.200 ký tự (≈2,4% của 2.000.000), nên đủ rộng rãi cho cả khi sửa bài nhiều lần.</w:t>
+        <w:t xml:space="preserve">Ước tính cho đồ án: nội dung tiếng Việt khoảng 11.800 ký tự, dịch sang 4 ngôn ngữ khoảng 47.200 ký tự, nhỉnh hơn ngưỡng một ngày, nên nhóm nhập nội dung trong 2 ngày (khoảng 6.400 ký tự cho mỗi điểm đến). Khách nghe không tốn hạn mức nào vì giọng đọc chạy trên thiết bị.</w:t>
       </w:r>
     </w:p>
     <w:p>
@@ -2916,7 +2893,7 @@
           <w:sz w:val="26"/>
           <w:szCs w:val="26"/>
         </w:rPr>
-        <w:t>4. Phát audio và phương án dự phòng</w:t>
+        <w:t xml:space="preserve">4. Đọc thuyết minh bằng giọng thiết bị</w:t>
       </w:r>
     </w:p>
     <w:p>
@@ -2936,7 +2913,7 @@
           <w:sz w:val="26"/>
           <w:szCs w:val="26"/>
         </w:rPr>
-        <w:t>Mỗi lần chỉ một bài phát; bấm bài khác sẽ dừng bài đang phát. Trình phát hỗ trợ tua ±10 giây và 3 mức tốc độ. Một lượt nghe được ghi (ẩn danh, hoặc gắn tài khoản nếu đã đăng nhập) khi nghe qua 10 giây. Nếu Place chưa có mp3 hoặc tải lỗi, giao diện chuyển sang giọng của thiết bị bằng Web Speech API và hiển thị nhãn để khách biết đang dùng giọng dự phòng.</w:t>
+        <w:t xml:space="preserve">Mỗi lần chỉ một bài được đọc; bấm bài khác sẽ dừng bài đang đọc (speechSynthesis.cancel). Trình phát chia bài thành từng câu, cho tạm dừng và tiếp tục, lùi hoặc tới một câu, và 3 mức tốc độ (0,8 / 1 / 1,25). Giọng được chọn theo mã ngôn ngữ (vi-VN, en-US, zh-CN, ko-KR, ja-JP); nếu máy không có giọng cho ngôn ngữ đó, giao diện hiện bản chữ và gợi ý cài giọng. speak() luôn được gọi trong thao tác chạm để chạy được trên iOS. Một lượt nghe được ghi (ẩn danh, hoặc gắn tài khoản nếu đã đăng nhập) khi đọc qua 10 giây.</w:t>
       </w:r>
     </w:p>
     <w:p>
@@ -3186,7 +3163,7 @@
           <w:sz w:val="26"/>
           <w:szCs w:val="26"/>
         </w:rPr>
-        <w:t>Bốn thiết bị trở lên quét cùng lúc không tranh chấp vì mỗi thiết bị có khóa riêng; API chạy một replica (maxReplicas = 1) nên bộ nhớ chung là nhất quán.</w:t>
+        <w:t xml:space="preserve">Bốn thiết bị trở lên quét cùng lúc không tranh chấp vì mỗi thiết bị có khóa riêng; API chạy một container nên bộ nhớ chung là nhất quán.</w:t>
       </w:r>
     </w:p>
     <w:p>
@@ -3961,7 +3938,7 @@
                 <w:sz w:val="26"/>
                 <w:szCs w:val="26"/>
               </w:rPr>
-              <w:t>Tua mỗi lần bấm</w:t>
+              <w:t xml:space="preserve">Lùi/tới mỗi lần bấm</w:t>
             </w:r>
           </w:p>
         </w:tc>
@@ -3985,7 +3962,7 @@
                 <w:sz w:val="26"/>
                 <w:szCs w:val="26"/>
               </w:rPr>
-              <w:t>±10 giây</w:t>
+              <w:t xml:space="preserve">1 câu</w:t>
             </w:r>
           </w:p>
         </w:tc>
@@ -4109,7 +4086,7 @@
                 <w:sz w:val="26"/>
                 <w:szCs w:val="26"/>
               </w:rPr>
-              <w:t>Ngưỡng chặn gọi dịch vụ</w:t>
+              <w:t xml:space="preserve">Ngưỡng chặn gọi MyMemory</w:t>
             </w:r>
           </w:p>
         </w:tc>
@@ -4133,7 +4110,7 @@
                 <w:sz w:val="26"/>
                 <w:szCs w:val="26"/>
               </w:rPr>
-              <w:t>90% hạn mức tháng</w:t>
+              <w:t xml:space="preserve">45.000 ký tự/ngày (90%)</w:t>
             </w:r>
           </w:p>
         </w:tc>
@@ -4183,7 +4160,7 @@
                 <w:sz w:val="26"/>
                 <w:szCs w:val="26"/>
               </w:rPr>
-              <w:t>Hạn mức Azure AI Speech (F0)</w:t>
+              <w:t xml:space="preserve">Hạn mức MyMemory (có email ở tham số de)</w:t>
             </w:r>
           </w:p>
         </w:tc>
@@ -4207,7 +4184,7 @@
                 <w:sz w:val="26"/>
                 <w:szCs w:val="26"/>
               </w:rPr>
-              <w:t>500.000 ký tự/tháng</w:t>
+              <w:t xml:space="preserve">50.000 ký tự/ngày (ẩn danh 5.000)</w:t>
             </w:r>
           </w:p>
         </w:tc>
@@ -4231,7 +4208,7 @@
                 <w:sz w:val="26"/>
                 <w:szCs w:val="26"/>
               </w:rPr>
-              <w:t>Azure pricing</w:t>
+              <w:t xml:space="preserve">MyMemory usage limits</w:t>
             </w:r>
           </w:p>
         </w:tc>
@@ -4257,7 +4234,7 @@
                 <w:sz w:val="26"/>
                 <w:szCs w:val="26"/>
               </w:rPr>
-              <w:t>Hạn mức Azure Translator (F0)</w:t>
+              <w:t xml:space="preserve">Độ dài tối đa một lần gọi MyMemory</w:t>
             </w:r>
           </w:p>
         </w:tc>
@@ -4281,7 +4258,7 @@
                 <w:sz w:val="26"/>
                 <w:szCs w:val="26"/>
               </w:rPr>
-              <w:t>2.000.000 ký tự/tháng</w:t>
+              <w:t xml:space="preserve">500 byte UTF-8 (tham số q)</w:t>
             </w:r>
           </w:p>
         </w:tc>
@@ -4305,7 +4282,7 @@
                 <w:sz w:val="26"/>
                 <w:szCs w:val="26"/>
               </w:rPr>
-              <w:t>Azure pricing</w:t>
+              <w:t xml:space="preserve">MyMemory API spec</w:t>
             </w:r>
           </w:p>
         </w:tc>
@@ -4479,7 +4456,7 @@
                 <w:sz w:val="26"/>
                 <w:szCs w:val="26"/>
               </w:rPr>
-              <w:t>Số replica của API</w:t>
+              <w:t xml:space="preserve">Số container API</w:t>
             </w:r>
           </w:p>
         </w:tc>
@@ -4578,13 +4555,6 @@
                 <w:szCs w:val="26"/>
               </w:rPr>
               <w:t xml:space="preserve">vĩ độ 10,730–10,765; kinh độ </w:t>
-            </w:r>
-            <w:r>
-              <w:rPr>
-                <w:rFonts w:ascii="Times New Roman" w:hAnsi="Times New Roman" w:cs="Times New Roman"/>
-                <w:sz w:val="26"/>
-                <w:szCs w:val="26"/>
-              </w:rPr>
               <w:lastRenderedPageBreak/>
               <w:t>106,615–106,665</w:t>
             </w:r>
@@ -4673,7 +4643,7 @@
           <w:sz w:val="26"/>
           <w:szCs w:val="26"/>
         </w:rPr>
-        <w:t>SQL Server (Azure SQL, gói miễn phí) gồm 9 bảng. Hai bảng Places và PlaceTranslations là lõi nội dung; ba bảng Favorites, Visits và ListenEvents ghi hoạt động của người dùng; UsageLogs ghi mức dùng dịch vụ Azure; AccessSessions ghi phiên truy cập.</w:t>
+        <w:t xml:space="preserve">MySQL 8.4 (container mysql:8.4 trên máy chủ Docker, bảng mã utf8mb4) gồm 9 bảng; EF Core dùng provider MySql.EntityFrameworkCore. Hai bảng Places và PlaceTranslations là lõi nội dung; ba bảng Favorites, Visits và ListenEvents ghi hoạt động của người dùng; UsageLogs ghi mức dùng MyMemory; AccessSessions ghi phiên truy cập.</w:t>
       </w:r>
     </w:p>
     <w:p>
@@ -4695,9 +4665,9 @@
         </w:rPr>
         <w:drawing>
           <wp:inline distT="0" distB="0" distL="0" distR="0">
-            <wp:extent cx="5943600" cy="3394996"/>
+            <wp:extent cx="5943600" cy="3425621"/>
             <wp:effectExtent l="0" t="0" r="0" b="0"/>
-            <wp:docPr id="36" name="Picture 36" descr="D:\dowload\tài liệu\tourvoice\TourVoice_PRD_Diagrams_PNG\out-21.png"/>
+            <wp:docPr id="36" name="Picture 36" descr="21 ERD"/>
             <wp:cNvGraphicFramePr>
               <a:graphicFrameLocks xmlns:a="http://schemas.openxmlformats.org/drawingml/2006/main" noChangeAspect="1"/>
             </wp:cNvGraphicFramePr>
@@ -4705,7 +4675,7 @@
               <a:graphicData uri="http://schemas.openxmlformats.org/drawingml/2006/picture">
                 <pic:pic xmlns:pic="http://schemas.openxmlformats.org/drawingml/2006/picture">
                   <pic:nvPicPr>
-                    <pic:cNvPr id="0" name="Picture 20" descr="D:\dowload\tài liệu\tourvoice\TourVoice_PRD_Diagrams_PNG\out-21.png"/>
+                    <pic:cNvPr id="0" name="Picture 20" descr="21 ERD"/>
                     <pic:cNvPicPr>
                       <a:picLocks noChangeAspect="1" noChangeArrowheads="1"/>
                     </pic:cNvPicPr>
@@ -4726,7 +4696,7 @@
                   <pic:spPr bwMode="auto">
                     <a:xfrm>
                       <a:off x="0" y="0"/>
-                      <a:ext cx="5943600" cy="3394996"/>
+                      <a:ext cx="5943600" cy="3425621"/>
                     </a:xfrm>
                     <a:prstGeom prst="rect">
                       <a:avLst/>
@@ -4985,7 +4955,7 @@
                 <w:sz w:val="26"/>
                 <w:szCs w:val="26"/>
               </w:rPr>
-              <w:t>PK (PlaceId, LanguageCode); Name, NarrationText, Status, Source, URL mp3, thời lượng, hash audio</w:t>
+              <w:t xml:space="preserve">PK (PlaceId, LanguageCode); Name, NarrationText, Status (Draft hoặc Reviewed), Source (Machine hoặc Manual), SourceHash, MachineMatch</w:t>
             </w:r>
           </w:p>
         </w:tc>
@@ -5035,7 +5005,7 @@
                 <w:sz w:val="26"/>
                 <w:szCs w:val="26"/>
               </w:rPr>
-              <w:t>5 ngôn ngữ và giọng đọc</w:t>
+              <w:t xml:space="preserve">5 ngôn ngữ</w:t>
             </w:r>
           </w:p>
         </w:tc>
@@ -5059,7 +5029,7 @@
                 <w:sz w:val="26"/>
                 <w:szCs w:val="26"/>
               </w:rPr>
-              <w:t>Code, mã Translator, tên giọng, trạng thái bật/tắt</w:t>
+              <w:t xml:space="preserve">Code, MtCode (mã MyMemory), SpeechLang (mã giọng BCP-47), trạng thái bật/tắt</w:t>
             </w:r>
           </w:p>
         </w:tc>
@@ -5355,7 +5325,7 @@
                 <w:sz w:val="26"/>
                 <w:szCs w:val="26"/>
               </w:rPr>
-              <w:t>PlaceId, LanguageCode, ListenedSeconds, Source (mp3 hoặc giọng thiết bị), PlayedAt</w:t>
+              <w:t xml:space="preserve">PlaceId, LanguageCode, ListenedSeconds, PlayedAt</w:t>
             </w:r>
           </w:p>
         </w:tc>
@@ -5405,7 +5375,7 @@
                 <w:sz w:val="26"/>
                 <w:szCs w:val="26"/>
               </w:rPr>
-              <w:t>Nhật ký dùng Translator và Speech, nguồn cho BR-06</w:t>
+              <w:t xml:space="preserve">Nhật ký gọi MyMemory, nguồn cho BR-06</w:t>
             </w:r>
           </w:p>
         </w:tc>
@@ -5429,7 +5399,7 @@
                 <w:sz w:val="26"/>
                 <w:szCs w:val="26"/>
               </w:rPr>
-              <w:t>Service, Characters, Success, ErrorCode, CreatedAt</w:t>
+              <w:t xml:space="preserve">Service, Characters, Chunks, Success, ErrorCode, CreatedAt</w:t>
             </w:r>
           </w:p>
         </w:tc>
@@ -5526,7 +5496,7 @@
           <w:sz w:val="26"/>
           <w:szCs w:val="26"/>
         </w:rPr>
-        <w:t xml:space="preserve">Số thiết bị đang truy cập không nằm trong SQL Server mà trong </w:t>
+        <w:t xml:space="preserve">Số thiết bị đang truy cập không nằm trong MySQL mà trong </w:t>
       </w:r>
       <w:r>
         <w:rPr>
@@ -5535,7 +5505,7 @@
           <w:sz w:val="26"/>
           <w:szCs w:val="26"/>
         </w:rPr>
-        <w:t>InMemoryPresenceStore</w:t>
+        <w:t xml:space="preserve">InMemoryPresenceStore</w:t>
       </w:r>
       <w:r>
         <w:rPr>
@@ -6398,7 +6368,7 @@
                 <w:sz w:val="26"/>
                 <w:szCs w:val="26"/>
               </w:rPr>
-              <w:t xml:space="preserve"> (sửa, translate, approve, audio), </w:t>
+              <w:t xml:space="preserve"> (sửa, translate, approve), </w:t>
             </w:r>
             <w:r>
               <w:rPr>
@@ -6550,15 +6520,8 @@
           <w:szCs w:val="26"/>
         </w:rPr>
         <w:t xml:space="preserve"> (chỉ có giá trị khi request kèm JWT </w:t>
-      </w:r>
-      <w:r>
-        <w:rPr>
-          <w:rFonts w:ascii="Times New Roman" w:hAnsi="Times New Roman" w:cs="Times New Roman"/>
-          <w:sz w:val="26"/>
-          <w:szCs w:val="26"/>
-        </w:rPr>
         <w:lastRenderedPageBreak/>
-        <w:t xml:space="preserve">Customer); khi bản dịch mới ở Reviewed, trường </w:t>
+        <w:t xml:space="preserve">Customer).</w:t>
       </w:r>
       <w:r>
         <w:rPr>
@@ -6567,15 +6530,15 @@
           <w:sz w:val="26"/>
           <w:szCs w:val="26"/>
         </w:rPr>
-        <w:t>audio</w:t>
-      </w:r>
-      <w:r>
-        <w:rPr>
-          <w:rFonts w:ascii="Times New Roman" w:hAnsi="Times New Roman" w:cs="Times New Roman"/>
-          <w:sz w:val="26"/>
-          <w:szCs w:val="26"/>
-        </w:rPr>
-        <w:t xml:space="preserve"> là null và frontend dùng giọng thiết bị.</w:t>
+        <w:t xml:space="preserve"/>
+      </w:r>
+      <w:r>
+        <w:rPr>
+          <w:rFonts w:ascii="Times New Roman" w:hAnsi="Times New Roman" w:cs="Times New Roman"/>
+          <w:sz w:val="26"/>
+          <w:szCs w:val="26"/>
+        </w:rPr>
+        <w:t xml:space="preserve"/>
       </w:r>
     </w:p>
     <w:p>
@@ -7349,9 +7312,9 @@
         <w:lastRenderedPageBreak/>
         <w:drawing>
           <wp:inline distT="0" distB="0" distL="0" distR="0">
-            <wp:extent cx="5943600" cy="4957073"/>
+            <wp:extent cx="5943600" cy="4956226"/>
             <wp:effectExtent l="0" t="0" r="0" b="0"/>
-            <wp:docPr id="37" name="Picture 37" descr="D:\dowload\tài liệu\tourvoice\TourVoice_PRD_Diagrams_PNG\out-7.png"/>
+            <wp:docPr id="37" name="Picture 37" descr="07 Mockup Home desktop"/>
             <wp:cNvGraphicFramePr>
               <a:graphicFrameLocks xmlns:a="http://schemas.openxmlformats.org/drawingml/2006/main" noChangeAspect="1"/>
             </wp:cNvGraphicFramePr>
@@ -7359,7 +7322,7 @@
               <a:graphicData uri="http://schemas.openxmlformats.org/drawingml/2006/picture">
                 <pic:pic xmlns:pic="http://schemas.openxmlformats.org/drawingml/2006/picture">
                   <pic:nvPicPr>
-                    <pic:cNvPr id="0" name="Picture 21" descr="D:\dowload\tài liệu\tourvoice\TourVoice_PRD_Diagrams_PNG\out-7.png"/>
+                    <pic:cNvPr id="0" name="Picture 21" descr="07 Mockup Home desktop"/>
                     <pic:cNvPicPr>
                       <a:picLocks noChangeAspect="1" noChangeArrowheads="1"/>
                     </pic:cNvPicPr>
@@ -7380,7 +7343,7 @@
                   <pic:spPr bwMode="auto">
                     <a:xfrm>
                       <a:off x="0" y="0"/>
-                      <a:ext cx="5943600" cy="4957073"/>
+                      <a:ext cx="5943600" cy="4956226"/>
                     </a:xfrm>
                     <a:prstGeom prst="rect">
                       <a:avLst/>
@@ -7417,9 +7380,9 @@
         <w:lastRenderedPageBreak/>
         <w:drawing>
           <wp:inline distT="0" distB="0" distL="0" distR="0">
-            <wp:extent cx="5943600" cy="4184937"/>
+            <wp:extent cx="5943600" cy="4210050"/>
             <wp:effectExtent l="0" t="0" r="0" b="0"/>
-            <wp:docPr id="38" name="Picture 38" descr="D:\dowload\tài liệu\tourvoice\TourVoice_PRD_Diagrams_PNG\out-8.png"/>
+            <wp:docPr id="38" name="Picture 38" descr="08 Mockup mobile"/>
             <wp:cNvGraphicFramePr>
               <a:graphicFrameLocks xmlns:a="http://schemas.openxmlformats.org/drawingml/2006/main" noChangeAspect="1"/>
             </wp:cNvGraphicFramePr>
@@ -7427,7 +7390,7 @@
               <a:graphicData uri="http://schemas.openxmlformats.org/drawingml/2006/picture">
                 <pic:pic xmlns:pic="http://schemas.openxmlformats.org/drawingml/2006/picture">
                   <pic:nvPicPr>
-                    <pic:cNvPr id="0" name="Picture 22" descr="D:\dowload\tài liệu\tourvoice\TourVoice_PRD_Diagrams_PNG\out-8.png"/>
+                    <pic:cNvPr id="0" name="Picture 22" descr="08 Mockup mobile"/>
                     <pic:cNvPicPr>
                       <a:picLocks noChangeAspect="1" noChangeArrowheads="1"/>
                     </pic:cNvPicPr>
@@ -7448,7 +7411,7 @@
                   <pic:spPr bwMode="auto">
                     <a:xfrm>
                       <a:off x="0" y="0"/>
-                      <a:ext cx="5943600" cy="4184937"/>
+                      <a:ext cx="5943600" cy="4210050"/>
                     </a:xfrm>
                     <a:prstGeom prst="rect">
                       <a:avLst/>
@@ -7485,9 +7448,9 @@
         <w:lastRenderedPageBreak/>
         <w:drawing>
           <wp:inline distT="0" distB="0" distL="0" distR="0">
-            <wp:extent cx="5943600" cy="4146404"/>
+            <wp:extent cx="5943600" cy="4193155"/>
             <wp:effectExtent l="0" t="0" r="0" b="0"/>
-            <wp:docPr id="39" name="Picture 39" descr="D:\dowload\tài liệu\tourvoice\TourVoice_PRD_Diagrams_PNG\out-9.png"/>
+            <wp:docPr id="39" name="Picture 39" descr="09 Mockup Admin Overview"/>
             <wp:cNvGraphicFramePr>
               <a:graphicFrameLocks xmlns:a="http://schemas.openxmlformats.org/drawingml/2006/main" noChangeAspect="1"/>
             </wp:cNvGraphicFramePr>
@@ -7495,7 +7458,7 @@
               <a:graphicData uri="http://schemas.openxmlformats.org/drawingml/2006/picture">
                 <pic:pic xmlns:pic="http://schemas.openxmlformats.org/drawingml/2006/picture">
                   <pic:nvPicPr>
-                    <pic:cNvPr id="0" name="Picture 23" descr="D:\dowload\tài liệu\tourvoice\TourVoice_PRD_Diagrams_PNG\out-9.png"/>
+                    <pic:cNvPr id="0" name="Picture 23" descr="09 Mockup Admin Overview"/>
                     <pic:cNvPicPr>
                       <a:picLocks noChangeAspect="1" noChangeArrowheads="1"/>
                     </pic:cNvPicPr>
@@ -7516,7 +7479,7 @@
                   <pic:spPr bwMode="auto">
                     <a:xfrm>
                       <a:off x="0" y="0"/>
-                      <a:ext cx="5943600" cy="4146404"/>
+                      <a:ext cx="5943600" cy="4193155"/>
                     </a:xfrm>
                     <a:prstGeom prst="rect">
                       <a:avLst/>
@@ -7738,7 +7701,7 @@
                 <w:sz w:val="26"/>
                 <w:szCs w:val="26"/>
               </w:rPr>
-              <w:t>Repo và branch protection, khung 3 lớp (API, BLL, DAL) có kiểm tra NetArchTest, CI xanh, triển khai bản rỗng lên Vercel và Container Apps</w:t>
+              <w:t xml:space="preserve">Repo và branch protection, khung 3 lớp (API, BLL, DAL) có kiểm tra NetArchTest, CI xanh, docker compose (API + MySQL), triển khai bản rỗng lên Vercel và máy chủ Docker</w:t>
             </w:r>
           </w:p>
         </w:tc>
@@ -7887,7 +7850,7 @@
                 <w:sz w:val="26"/>
                 <w:szCs w:val="26"/>
               </w:rPr>
-              <w:t>Pipeline dịch và TTS, chặn hạn mức, trình phát audio có giọng dự phòng, mã QR, nghe thử 5 ngôn ngữ</w:t>
+              <w:t xml:space="preserve">Dịch bằng MyMemory và duyệt, chặn hạn mức, trình phát Web Speech có bản chữ dự phòng, mã QR, nghe thử 5 ngôn ngữ</w:t>
             </w:r>
           </w:p>
         </w:tc>
@@ -8082,7 +8045,7 @@
           <w:sz w:val="26"/>
           <w:szCs w:val="26"/>
         </w:rPr>
-        <w:t>Có ít nhất 4 điểm đến và ≥ 12 món, mỗi mục có audio ở cả 5 ngôn ngữ.</w:t>
+        <w:t xml:space="preserve">Có ít nhất 4 điểm đến và ≥ 12 món, mỗi mục có bản thuyết minh Reviewed ở cả 5 ngôn ngữ và đọc được trên ≥ 4 điện thoại thật.</w:t>
       </w:r>
     </w:p>
     <w:p>
@@ -8182,7 +8145,7 @@
           <w:sz w:val="26"/>
           <w:szCs w:val="26"/>
         </w:rPr>
-        <w:t xml:space="preserve"> nếu mạng hoặc Azure sự cố, chạy </w:t>
+        <w:t xml:space="preserve"> nếu mạng hoặc máy chủ Docker sự cố, chạy </w:t>
       </w:r>
       <w:r>
         <w:rPr>
@@ -8267,9 +8230,9 @@
         <w:lastRenderedPageBreak/>
         <w:drawing>
           <wp:inline distT="0" distB="0" distL="0" distR="0">
-            <wp:extent cx="5943600" cy="2543416"/>
+            <wp:extent cx="5943600" cy="2655447"/>
             <wp:effectExtent l="0" t="0" r="0" b="0"/>
-            <wp:docPr id="40" name="Picture 40" descr="D:\dowload\tài liệu\tourvoice\TourVoice_PRD_Diagrams_PNG\out-23.png"/>
+            <wp:docPr id="40" name="Picture 40" descr="23 Roadmap"/>
             <wp:cNvGraphicFramePr>
               <a:graphicFrameLocks xmlns:a="http://schemas.openxmlformats.org/drawingml/2006/main" noChangeAspect="1"/>
             </wp:cNvGraphicFramePr>
@@ -8277,7 +8240,7 @@
               <a:graphicData uri="http://schemas.openxmlformats.org/drawingml/2006/picture">
                 <pic:pic xmlns:pic="http://schemas.openxmlformats.org/drawingml/2006/picture">
                   <pic:nvPicPr>
-                    <pic:cNvPr id="0" name="Picture 24" descr="D:\dowload\tài liệu\tourvoice\TourVoice_PRD_Diagrams_PNG\out-23.png"/>
+                    <pic:cNvPr id="0" name="Picture 24" descr="23 Roadmap"/>
                     <pic:cNvPicPr>
                       <a:picLocks noChangeAspect="1" noChangeArrowheads="1"/>
                     </pic:cNvPicPr>
@@ -8298,7 +8261,7 @@
                   <pic:spPr bwMode="auto">
                     <a:xfrm>
                       <a:off x="0" y="0"/>
-                      <a:ext cx="5943600" cy="2543416"/>
+                      <a:ext cx="5943600" cy="2655447"/>
                     </a:xfrm>
                     <a:prstGeom prst="rect">
                       <a:avLst/>
@@ -8484,6 +8447,56 @@
           </w:p>
         </w:tc>
       </w:tr>
+      <w:tr>
+        <w:tc>
+          <w:tcPr>
+            <w:tcW w:w="2009" w:type="dxa"/>
+          </w:tcPr>
+          <w:p>
+            <w:pPr>
+              <w:spacing w:line="360" w:lineRule="auto"/>
+              <w:jc w:val="both"/>
+              <w:rPr>
+                <w:rFonts w:ascii="Times New Roman" w:hAnsi="Times New Roman" w:cs="Times New Roman"/>
+                <w:sz w:val="26"/>
+                <w:szCs w:val="26"/>
+              </w:rPr>
+            </w:pPr>
+            <w:r>
+              <w:rPr>
+                <w:rFonts w:ascii="Times New Roman" w:hAnsi="Times New Roman" w:cs="Times New Roman"/>
+                <w:sz w:val="26"/>
+                <w:szCs w:val="26"/>
+              </w:rPr>
+              <w:t>2026-10-26</w:t>
+            </w:r>
+          </w:p>
+        </w:tc>
+        <w:tc>
+          <w:tcPr>
+            <w:tcW w:w="7350" w:type="dxa"/>
+          </w:tcPr>
+          <w:p>
+            <w:pPr>
+              <w:spacing w:line="360" w:lineRule="auto"/>
+              <w:jc w:val="both"/>
+              <w:rPr>
+                <w:rFonts w:ascii="Times New Roman" w:hAnsi="Times New Roman" w:cs="Times New Roman"/>
+                <w:sz w:val="26"/>
+                <w:szCs w:val="26"/>
+              </w:rPr>
+            </w:pPr>
+            <w:r>
+              <w:rPr>
+                <w:rFonts w:ascii="Times New Roman" w:hAnsi="Times New Roman" w:cs="Times New Roman"/>
+                <w:sz w:val="26"/>
+                <w:szCs w:val="26"/>
+              </w:rPr>
+              <w:t>Bỏ Azure: dịch máy chuyển sang MyMemory, giọng đọc dùng Web Speech API của trình duyệt (không còn mp3, Blob, trạng thái Generating/AudioReady/AudioFailed), CSDL chuyển sang MySQL 8.4 chạy cùng API bằng docker compose; cập nhật BR-05, BR-06, mô hình dữ liệu, CI/CD và toàn bộ sơ đồ</w:t>
+            </w:r>
+          </w:p>
+        </w:tc>
+      </w:tr>
     </w:tbl>
     <w:p>
       <w:pPr>
@@ -8664,15 +8677,15 @@
           <w:sz w:val="26"/>
           <w:szCs w:val="26"/>
         </w:rPr>
-        <w:t>Vì sao dùng Azure thay vì các dịch vụ TTS miễn phí khác?</w:t>
-      </w:r>
-      <w:r>
-        <w:rPr>
-          <w:rFonts w:ascii="Times New Roman" w:hAnsi="Times New Roman" w:cs="Times New Roman"/>
-          <w:sz w:val="26"/>
-          <w:szCs w:val="26"/>
-        </w:rPr>
-        <w:t xml:space="preserve"> Azure for Students cho sẵn Speech F0 (0,5 triệu ký tự/tháng) và Translator F0 (2 triệu ký tự/tháng), giọng đủ 5 ngôn ngữ và chất lượng đủ để thuyết minh. Audio tạo sẵn nên chỉ tốn hạn mức khi admin tạo, không tốn khi khách nghe.</w:t>
+        <w:t xml:space="preserve">Vì sao dùng MyMemory và Web Speech thay vì Azure?</w:t>
+      </w:r>
+      <w:r>
+        <w:rPr>
+          <w:rFonts w:ascii="Times New Roman" w:hAnsi="Times New Roman" w:cs="Times New Roman"/>
+          <w:sz w:val="26"/>
+          <w:szCs w:val="26"/>
+        </w:rPr>
+        <w:t xml:space="preserve"> MyMemory miễn phí, không cần tài khoản hay thẻ, chỉ là một lệnh GET; gửi kèm email ở tham số de thì được 50.000 ký tự/ngày, đủ cho nội dung đồ án. Web Speech có sẵn trong trình duyệt nên đọc ngay, không tốn hạn mức và không cần lưu file. Đánh đổi: giọng khác nhau giữa các máy, và máy chưa cài giọng ko/ja/zh chỉ hiện bản chữ.</w:t>
       </w:r>
     </w:p>
     <w:p>
@@ -8848,15 +8861,15 @@
           <w:sz w:val="26"/>
           <w:szCs w:val="26"/>
         </w:rPr>
-        <w:t>Nếu hết hạn mức giữa chừng thì khách có bị ảnh hưởng?</w:t>
-      </w:r>
-      <w:r>
-        <w:rPr>
-          <w:rFonts w:ascii="Times New Roman" w:hAnsi="Times New Roman" w:cs="Times New Roman"/>
-          <w:sz w:val="26"/>
-          <w:szCs w:val="26"/>
-        </w:rPr>
-        <w:t xml:space="preserve"> Không. Hạn mức chỉ cấm admin tạo thêm audio hoặc dịch mới; audio đã có vẫn phát bình thường, và khi thiếu mp3 trình phát dùng giọng thiết bị.</w:t>
+        <w:t xml:space="preserve">Nếu hết hạn mức giữa chừng thì khách có bị ảnh hưởng?</w:t>
+      </w:r>
+      <w:r>
+        <w:rPr>
+          <w:rFonts w:ascii="Times New Roman" w:hAnsi="Times New Roman" w:cs="Times New Roman"/>
+          <w:sz w:val="26"/>
+          <w:szCs w:val="26"/>
+        </w:rPr>
+        <w:t xml:space="preserve"> Không. Hạn mức chỉ cấm admin dịch thêm trong ngày; khách vẫn đọc và nghe các bản đã duyệt bình thường vì giọng đọc chạy trên thiết bị.</w:t>
       </w:r>
     </w:p>
     <w:p>
@@ -9096,7 +9109,7 @@
                 <w:sz w:val="26"/>
                 <w:szCs w:val="26"/>
               </w:rPr>
-              <w:t>SQL Server trên Azure SQL (gói miễn phí, serverless)</w:t>
+              <w:t xml:space="preserve">MySQL 8.4 trong Docker (provider MySql.EntityFrameworkCore)</w:t>
             </w:r>
           </w:p>
         </w:tc>
@@ -9120,7 +9133,7 @@
                 <w:sz w:val="26"/>
                 <w:szCs w:val="26"/>
               </w:rPr>
-              <w:t>Miễn phí trong hạn mức</w:t>
+              <w:t xml:space="preserve">Miễn phí (mã nguồn mở)</w:t>
             </w:r>
           </w:p>
         </w:tc>
@@ -9295,7 +9308,7 @@
                 <w:sz w:val="26"/>
                 <w:szCs w:val="26"/>
               </w:rPr>
-              <w:t>Giọng đọc</w:t>
+              <w:t xml:space="preserve">Giọng đọc</w:t>
             </w:r>
           </w:p>
         </w:tc>
@@ -9319,7 +9332,7 @@
                 <w:sz w:val="26"/>
                 <w:szCs w:val="26"/>
               </w:rPr>
-              <w:t>Azure AI Speech, gói F0</w:t>
+              <w:t xml:space="preserve">Web Speech API của trình duyệt</w:t>
             </w:r>
           </w:p>
         </w:tc>
@@ -9343,7 +9356,7 @@
                 <w:sz w:val="26"/>
                 <w:szCs w:val="26"/>
               </w:rPr>
-              <w:t>Miễn phí, 500.000 ký tự/tháng</w:t>
+              <w:t xml:space="preserve">Miễn phí, không hạn mức</w:t>
             </w:r>
           </w:p>
         </w:tc>
@@ -9393,7 +9406,7 @@
                 <w:sz w:val="26"/>
                 <w:szCs w:val="26"/>
               </w:rPr>
-              <w:t>Azure Translator, gói F0</w:t>
+              <w:t xml:space="preserve">MyMemory Translated API</w:t>
             </w:r>
           </w:p>
         </w:tc>
@@ -9417,7 +9430,7 @@
                 <w:sz w:val="26"/>
                 <w:szCs w:val="26"/>
               </w:rPr>
-              <w:t>Miễn phí, 2.000.000 ký tự/tháng</w:t>
+              <w:t xml:space="preserve">Miễn phí, 50.000 ký tự/ngày với email</w:t>
             </w:r>
           </w:p>
         </w:tc>
@@ -9443,7 +9456,7 @@
                 <w:sz w:val="26"/>
                 <w:szCs w:val="26"/>
               </w:rPr>
-              <w:t>Lưu audio và ảnh</w:t>
+              <w:t xml:space="preserve">Lưu ảnh</w:t>
             </w:r>
           </w:p>
         </w:tc>
@@ -9467,7 +9480,7 @@
                 <w:sz w:val="26"/>
                 <w:szCs w:val="26"/>
               </w:rPr>
-              <w:t>Azure Blob Storage (LRS, đọc công khai)</w:t>
+              <w:t xml:space="preserve">Volume Docker uploads, API phục vụ tại /uploads</w:t>
             </w:r>
           </w:p>
         </w:tc>
@@ -9491,7 +9504,7 @@
                 <w:sz w:val="26"/>
                 <w:szCs w:val="26"/>
               </w:rPr>
-              <w:t>Chi phí rất nhỏ, nằm trong tín dụng Azure for Students</w:t>
+              <w:t xml:space="preserve">Miễn phí</w:t>
             </w:r>
           </w:p>
         </w:tc>
@@ -9541,7 +9554,7 @@
                 <w:sz w:val="26"/>
                 <w:szCs w:val="26"/>
               </w:rPr>
-              <w:t>Docker trên Azure Container Apps (0,25 vCPU, 0,5 GiB, scale 0 đến 1)</w:t>
+              <w:t xml:space="preserve">docker compose (API + MySQL) trên VPS Linux; dự phòng máy nhóm + Cloudflare Tunnel</w:t>
             </w:r>
           </w:p>
         </w:tc>
@@ -9565,7 +9578,7 @@
                 <w:sz w:val="26"/>
                 <w:szCs w:val="26"/>
               </w:rPr>
-              <w:t>Trong tín dụng Azure for Students</w:t>
+              <w:t xml:space="preserve">Theo gói VPS, hoặc 0đ với máy nhóm</w:t>
             </w:r>
           </w:p>
         </w:tc>
@@ -9763,7 +9776,7 @@
                 <w:sz w:val="26"/>
                 <w:szCs w:val="26"/>
               </w:rPr>
-              <w:t>Google Maps Platform, Azure SQL gói trả phí, Redis</w:t>
+              <w:t xml:space="preserve">Google Maps Platform, MySQL managed, Redis</w:t>
             </w:r>
           </w:p>
         </w:tc>
@@ -9954,7 +9967,7 @@
                 <w:sz w:val="26"/>
                 <w:szCs w:val="26"/>
               </w:rPr>
-              <w:t>TTS</w:t>
+              <w:t xml:space="preserve">TTS · Web Speech</w:t>
             </w:r>
           </w:p>
         </w:tc>
@@ -9978,7 +9991,7 @@
                 <w:sz w:val="26"/>
                 <w:szCs w:val="26"/>
               </w:rPr>
-              <w:t>Text-to-Speech, chuyển văn bản thành giọng nói</w:t>
+              <w:t xml:space="preserve">Text-to-Speech; ở đây là API speechSynthesis có sẵn trong trình duyệt</w:t>
             </w:r>
           </w:p>
         </w:tc>
@@ -10684,7 +10697,7 @@
           <w:sz w:val="26"/>
           <w:szCs w:val="26"/>
         </w:rPr>
-        <w:t>Trang giá Azure AI Speech và Azure Translator (azure.microsoft.com/pricing); nên kiểm tra lại hạn mức F0 trước khi nộp.</w:t>
+        <w:t xml:space="preserve">MyMemory API technical specifications và Usage limits (mymemory.translated.net/doc); MDN Web Speech API (SpeechSynthesis); nên kiểm tra lại hạn mức trước khi nộp.</w:t>
       </w:r>
     </w:p>
     <w:p>
@@ -10756,7 +10769,7 @@
           <w:sz w:val="26"/>
           <w:szCs w:val="26"/>
         </w:rPr>
-        <w:t>Chính sách gói Hobby của Vercel và giá Cloudflare Containers.</w:t>
+        <w:t xml:space="preserve">Chính sách gói Hobby của Vercel; MySQL 8.4 Docker image; MySql.EntityFrameworkCore trên NuGet.</w:t>
       </w:r>
     </w:p>
     <w:p>

</xml_diff>